<commit_message>
Chore (App): Updated documentations in the context of database security
</commit_message>
<xml_diff>
--- a/docs/UnivaWealth_Technical_Report.docx
+++ b/docs/UnivaWealth_Technical_Report.docx
@@ -2084,7 +2084,6 @@
                 <w:rFonts w:ascii="Calibri" w:hAnsi="Calibri" w:cs="Calibri" w:eastAsia="Calibri"/>
                 <w:spacing w:val="0"/>
                 <w:position w:val="0"/>
-                <w:shd w:fill="auto" w:val="clear"/>
               </w:rPr>
             </w:pPr>
             <w:r>
@@ -2126,7 +2125,6 @@
                 <w:rFonts w:ascii="Calibri" w:hAnsi="Calibri" w:cs="Calibri" w:eastAsia="Calibri"/>
                 <w:spacing w:val="0"/>
                 <w:position w:val="0"/>
-                <w:shd w:fill="auto" w:val="clear"/>
               </w:rPr>
             </w:pPr>
             <w:r>
@@ -2168,7 +2166,6 @@
                 <w:rFonts w:ascii="Calibri" w:hAnsi="Calibri" w:cs="Calibri" w:eastAsia="Calibri"/>
                 <w:spacing w:val="0"/>
                 <w:position w:val="0"/>
-                <w:shd w:fill="auto" w:val="clear"/>
               </w:rPr>
             </w:pPr>
             <w:r>
@@ -2216,7 +2213,6 @@
                 <w:rFonts w:ascii="Calibri" w:hAnsi="Calibri" w:cs="Calibri" w:eastAsia="Calibri"/>
                 <w:spacing w:val="0"/>
                 <w:position w:val="0"/>
-                <w:shd w:fill="auto" w:val="clear"/>
               </w:rPr>
             </w:pPr>
             <w:r>
@@ -2257,7 +2253,6 @@
                 <w:rFonts w:ascii="Calibri" w:hAnsi="Calibri" w:cs="Calibri" w:eastAsia="Calibri"/>
                 <w:spacing w:val="0"/>
                 <w:position w:val="0"/>
-                <w:shd w:fill="auto" w:val="clear"/>
               </w:rPr>
             </w:pPr>
             <w:r>
@@ -2298,7 +2293,6 @@
                 <w:rFonts w:ascii="Calibri" w:hAnsi="Calibri" w:cs="Calibri" w:eastAsia="Calibri"/>
                 <w:spacing w:val="0"/>
                 <w:position w:val="0"/>
-                <w:shd w:fill="auto" w:val="clear"/>
               </w:rPr>
             </w:pPr>
             <w:r>
@@ -2345,7 +2339,6 @@
                 <w:rFonts w:ascii="Calibri" w:hAnsi="Calibri" w:cs="Calibri" w:eastAsia="Calibri"/>
                 <w:spacing w:val="0"/>
                 <w:position w:val="0"/>
-                <w:shd w:fill="auto" w:val="clear"/>
               </w:rPr>
             </w:pPr>
             <w:r>
@@ -2386,7 +2379,6 @@
                 <w:rFonts w:ascii="Calibri" w:hAnsi="Calibri" w:cs="Calibri" w:eastAsia="Calibri"/>
                 <w:spacing w:val="0"/>
                 <w:position w:val="0"/>
-                <w:shd w:fill="auto" w:val="clear"/>
               </w:rPr>
             </w:pPr>
             <w:r>
@@ -2427,7 +2419,6 @@
                 <w:rFonts w:ascii="Calibri" w:hAnsi="Calibri" w:cs="Calibri" w:eastAsia="Calibri"/>
                 <w:spacing w:val="0"/>
                 <w:position w:val="0"/>
-                <w:shd w:fill="auto" w:val="clear"/>
               </w:rPr>
             </w:pPr>
             <w:r>
@@ -2474,7 +2465,6 @@
                 <w:rFonts w:ascii="Calibri" w:hAnsi="Calibri" w:cs="Calibri" w:eastAsia="Calibri"/>
                 <w:spacing w:val="0"/>
                 <w:position w:val="0"/>
-                <w:shd w:fill="auto" w:val="clear"/>
               </w:rPr>
             </w:pPr>
             <w:r>
@@ -2515,7 +2505,6 @@
                 <w:rFonts w:ascii="Calibri" w:hAnsi="Calibri" w:cs="Calibri" w:eastAsia="Calibri"/>
                 <w:spacing w:val="0"/>
                 <w:position w:val="0"/>
-                <w:shd w:fill="auto" w:val="clear"/>
               </w:rPr>
             </w:pPr>
             <w:r>
@@ -2556,7 +2545,6 @@
                 <w:rFonts w:ascii="Calibri" w:hAnsi="Calibri" w:cs="Calibri" w:eastAsia="Calibri"/>
                 <w:spacing w:val="0"/>
                 <w:position w:val="0"/>
-                <w:shd w:fill="auto" w:val="clear"/>
               </w:rPr>
             </w:pPr>
             <w:r>
@@ -2603,7 +2591,6 @@
                 <w:rFonts w:ascii="Calibri" w:hAnsi="Calibri" w:cs="Calibri" w:eastAsia="Calibri"/>
                 <w:spacing w:val="0"/>
                 <w:position w:val="0"/>
-                <w:shd w:fill="auto" w:val="clear"/>
               </w:rPr>
             </w:pPr>
             <w:r>
@@ -2644,7 +2631,6 @@
                 <w:rFonts w:ascii="Calibri" w:hAnsi="Calibri" w:cs="Calibri" w:eastAsia="Calibri"/>
                 <w:spacing w:val="0"/>
                 <w:position w:val="0"/>
-                <w:shd w:fill="auto" w:val="clear"/>
               </w:rPr>
             </w:pPr>
             <w:r>
@@ -2685,7 +2671,6 @@
                 <w:rFonts w:ascii="Calibri" w:hAnsi="Calibri" w:cs="Calibri" w:eastAsia="Calibri"/>
                 <w:spacing w:val="0"/>
                 <w:position w:val="0"/>
-                <w:shd w:fill="auto" w:val="clear"/>
               </w:rPr>
             </w:pPr>
             <w:r>
@@ -2732,7 +2717,6 @@
                 <w:rFonts w:ascii="Calibri" w:hAnsi="Calibri" w:cs="Calibri" w:eastAsia="Calibri"/>
                 <w:spacing w:val="0"/>
                 <w:position w:val="0"/>
-                <w:shd w:fill="auto" w:val="clear"/>
               </w:rPr>
             </w:pPr>
             <w:r>
@@ -2773,7 +2757,6 @@
                 <w:rFonts w:ascii="Calibri" w:hAnsi="Calibri" w:cs="Calibri" w:eastAsia="Calibri"/>
                 <w:spacing w:val="0"/>
                 <w:position w:val="0"/>
-                <w:shd w:fill="auto" w:val="clear"/>
               </w:rPr>
             </w:pPr>
             <w:r>
@@ -2814,7 +2797,6 @@
                 <w:rFonts w:ascii="Calibri" w:hAnsi="Calibri" w:cs="Calibri" w:eastAsia="Calibri"/>
                 <w:spacing w:val="0"/>
                 <w:position w:val="0"/>
-                <w:shd w:fill="auto" w:val="clear"/>
               </w:rPr>
             </w:pPr>
             <w:r>
@@ -2861,7 +2843,6 @@
                 <w:rFonts w:ascii="Calibri" w:hAnsi="Calibri" w:cs="Calibri" w:eastAsia="Calibri"/>
                 <w:spacing w:val="0"/>
                 <w:position w:val="0"/>
-                <w:shd w:fill="auto" w:val="clear"/>
               </w:rPr>
             </w:pPr>
             <w:r>
@@ -2902,7 +2883,6 @@
                 <w:rFonts w:ascii="Calibri" w:hAnsi="Calibri" w:cs="Calibri" w:eastAsia="Calibri"/>
                 <w:spacing w:val="0"/>
                 <w:position w:val="0"/>
-                <w:shd w:fill="auto" w:val="clear"/>
               </w:rPr>
             </w:pPr>
             <w:r>
@@ -2943,7 +2923,6 @@
                 <w:rFonts w:ascii="Calibri" w:hAnsi="Calibri" w:cs="Calibri" w:eastAsia="Calibri"/>
                 <w:spacing w:val="0"/>
                 <w:position w:val="0"/>
-                <w:shd w:fill="auto" w:val="clear"/>
               </w:rPr>
             </w:pPr>
             <w:r>
@@ -2990,7 +2969,6 @@
                 <w:rFonts w:ascii="Calibri" w:hAnsi="Calibri" w:cs="Calibri" w:eastAsia="Calibri"/>
                 <w:spacing w:val="0"/>
                 <w:position w:val="0"/>
-                <w:shd w:fill="auto" w:val="clear"/>
               </w:rPr>
             </w:pPr>
             <w:r>
@@ -3031,7 +3009,6 @@
                 <w:rFonts w:ascii="Calibri" w:hAnsi="Calibri" w:cs="Calibri" w:eastAsia="Calibri"/>
                 <w:spacing w:val="0"/>
                 <w:position w:val="0"/>
-                <w:shd w:fill="auto" w:val="clear"/>
               </w:rPr>
             </w:pPr>
             <w:r>
@@ -3072,7 +3049,6 @@
                 <w:rFonts w:ascii="Calibri" w:hAnsi="Calibri" w:cs="Calibri" w:eastAsia="Calibri"/>
                 <w:spacing w:val="0"/>
                 <w:position w:val="0"/>
-                <w:shd w:fill="auto" w:val="clear"/>
               </w:rPr>
             </w:pPr>
             <w:r>
@@ -4813,8 +4789,8 @@
         </w:rPr>
       </w:pPr>
       <w:r>
-        <w:object w:dxaOrig="5859" w:dyaOrig="4289">
-          <v:rect xmlns:o="urn:schemas-microsoft-com:office:office" xmlns:v="urn:schemas-microsoft-com:vml" id="rectole0000000000" style="width:292.950000pt;height:214.450000pt" o:preferrelative="t" o:ole="">
+        <w:object w:dxaOrig="5932" w:dyaOrig="4333">
+          <v:rect xmlns:o="urn:schemas-microsoft-com:office:office" xmlns:v="urn:schemas-microsoft-com:vml" id="rectole0000000000" style="width:296.600000pt;height:216.650000pt" o:preferrelative="t" o:ole="">
             <o:lock v:ext="edit"/>
             <v:imagedata xmlns:r="http://schemas.openxmlformats.org/officeDocument/2006/relationships" r:id="docRId1" o:title=""/>
           </v:rect>
@@ -4863,8 +4839,8 @@
         </w:rPr>
       </w:pPr>
       <w:r>
-        <w:object w:dxaOrig="5820" w:dyaOrig="6070">
-          <v:rect xmlns:o="urn:schemas-microsoft-com:office:office" xmlns:v="urn:schemas-microsoft-com:vml" id="rectole0000000001" style="width:291.000000pt;height:303.500000pt" o:preferrelative="t" o:ole="">
+        <w:object w:dxaOrig="5892" w:dyaOrig="6155">
+          <v:rect xmlns:o="urn:schemas-microsoft-com:office:office" xmlns:v="urn:schemas-microsoft-com:vml" id="rectole0000000001" style="width:294.600000pt;height:307.750000pt" o:preferrelative="t" o:ole="">
             <o:lock v:ext="edit"/>
             <v:imagedata xmlns:r="http://schemas.openxmlformats.org/officeDocument/2006/relationships" r:id="docRId3" o:title=""/>
           </v:rect>
@@ -4928,8 +4904,8 @@
         </w:rPr>
       </w:pPr>
       <w:r>
-        <w:object w:dxaOrig="8290" w:dyaOrig="4169">
-          <v:rect xmlns:o="urn:schemas-microsoft-com:office:office" xmlns:v="urn:schemas-microsoft-com:vml" id="rectole0000000002" style="width:414.500000pt;height:208.450000pt" o:preferrelative="t" o:ole="">
+        <w:object w:dxaOrig="8402" w:dyaOrig="4211">
+          <v:rect xmlns:o="urn:schemas-microsoft-com:office:office" xmlns:v="urn:schemas-microsoft-com:vml" id="rectole0000000002" style="width:420.100000pt;height:210.550000pt" o:preferrelative="t" o:ole="">
             <o:lock v:ext="edit"/>
             <v:imagedata xmlns:r="http://schemas.openxmlformats.org/officeDocument/2006/relationships" r:id="docRId5" o:title=""/>
           </v:rect>
@@ -4993,8 +4969,8 @@
         </w:rPr>
       </w:pPr>
       <w:r>
-        <w:object w:dxaOrig="8290" w:dyaOrig="4199">
-          <v:rect xmlns:o="urn:schemas-microsoft-com:office:office" xmlns:v="urn:schemas-microsoft-com:vml" id="rectole0000000003" style="width:414.500000pt;height:209.950000pt" o:preferrelative="t" o:ole="">
+        <w:object w:dxaOrig="8402" w:dyaOrig="4251">
+          <v:rect xmlns:o="urn:schemas-microsoft-com:office:office" xmlns:v="urn:schemas-microsoft-com:vml" id="rectole0000000003" style="width:420.100000pt;height:212.550000pt" o:preferrelative="t" o:ole="">
             <o:lock v:ext="edit"/>
             <v:imagedata xmlns:r="http://schemas.openxmlformats.org/officeDocument/2006/relationships" r:id="docRId7" o:title=""/>
           </v:rect>
@@ -5058,8 +5034,8 @@
         </w:rPr>
       </w:pPr>
       <w:r>
-        <w:object w:dxaOrig="8280" w:dyaOrig="4169">
-          <v:rect xmlns:o="urn:schemas-microsoft-com:office:office" xmlns:v="urn:schemas-microsoft-com:vml" id="rectole0000000004" style="width:414.000000pt;height:208.450000pt" o:preferrelative="t" o:ole="">
+        <w:object w:dxaOrig="8382" w:dyaOrig="4211">
+          <v:rect xmlns:o="urn:schemas-microsoft-com:office:office" xmlns:v="urn:schemas-microsoft-com:vml" id="rectole0000000004" style="width:419.100000pt;height:210.550000pt" o:preferrelative="t" o:ole="">
             <o:lock v:ext="edit"/>
             <v:imagedata xmlns:r="http://schemas.openxmlformats.org/officeDocument/2006/relationships" r:id="docRId9" o:title=""/>
           </v:rect>
@@ -5123,8 +5099,8 @@
         </w:rPr>
       </w:pPr>
       <w:r>
-        <w:object w:dxaOrig="8299" w:dyaOrig="4229">
-          <v:rect xmlns:o="urn:schemas-microsoft-com:office:office" xmlns:v="urn:schemas-microsoft-com:vml" id="rectole0000000005" style="width:414.950000pt;height:211.450000pt" o:preferrelative="t" o:ole="">
+        <w:object w:dxaOrig="8402" w:dyaOrig="4272">
+          <v:rect xmlns:o="urn:schemas-microsoft-com:office:office" xmlns:v="urn:schemas-microsoft-com:vml" id="rectole0000000005" style="width:420.100000pt;height:213.600000pt" o:preferrelative="t" o:ole="">
             <o:lock v:ext="edit"/>
             <v:imagedata xmlns:r="http://schemas.openxmlformats.org/officeDocument/2006/relationships" r:id="docRId11" o:title=""/>
           </v:rect>
@@ -5415,6 +5391,36 @@
     </w:p>
     <w:p>
       <w:pPr>
+        <w:numPr>
+          <w:ilvl w:val="0"/>
+          <w:numId w:val="82"/>
+        </w:numPr>
+        <w:spacing w:before="0" w:after="80" w:line="280"/>
+        <w:ind w:right="0" w:left="720" w:hanging="360"/>
+        <w:jc w:val="left"/>
+        <w:rPr>
+          <w:rFonts w:ascii="Calibri" w:hAnsi="Calibri" w:cs="Calibri" w:eastAsia="Calibri"/>
+          <w:color w:val="auto"/>
+          <w:spacing w:val="0"/>
+          <w:position w:val="0"/>
+          <w:sz w:val="22"/>
+          <w:shd w:fill="auto" w:val="clear"/>
+        </w:rPr>
+      </w:pPr>
+      <w:r>
+        <w:rPr>
+          <w:rFonts w:ascii="Calibri" w:hAnsi="Calibri" w:cs="Calibri" w:eastAsia="Calibri"/>
+          <w:color w:val="auto"/>
+          <w:spacing w:val="0"/>
+          <w:position w:val="0"/>
+          <w:sz w:val="22"/>
+          <w:shd w:fill="auto" w:val="clear"/>
+        </w:rPr>
+        <w:t xml:space="preserve">Sqlite does not have the capability to implement parameterized stored procedure queries which is ideal for added database security. This is where it is recommended to use a server-based secured data persistence.</w:t>
+      </w:r>
+    </w:p>
+    <w:p>
+      <w:pPr>
         <w:spacing w:before="360" w:after="180" w:line="240"/>
         <w:ind w:right="0" w:left="0" w:firstLine="0"/>
         <w:jc w:val="left"/>
@@ -5533,18 +5539,7 @@
           <w:sz w:val="22"/>
           <w:shd w:fill="auto" w:val="clear"/>
         </w:rPr>
-        <w:t xml:space="preserve">It succeeds in its primary goal of giving object-oriented principles a concrete, non-trivial setting to be applied in, while also being honest about the pieces, eg, </w:t>
-      </w:r>
-      <w:r>
-        <w:rPr>
-          <w:rFonts w:ascii="Calibri" w:hAnsi="Calibri" w:cs="Calibri" w:eastAsia="Calibri"/>
-          <w:color w:val="auto"/>
-          <w:spacing w:val="0"/>
-          <w:position w:val="0"/>
-          <w:sz w:val="22"/>
-          <w:shd w:fill="auto" w:val="clear"/>
-        </w:rPr>
-        <w:t xml:space="preserve">interest accrual, input validation rules, and a few placeholder methods, that remain unfinished and are documented as such rather than glossed over.</w:t>
+        <w:t xml:space="preserve">It succeeds in its primary goal of giving object-oriented principles a concrete, non-trivial setting to be applied in, while also being honest about the pieces, eg, interest accrual, input validation rules, and a few placeholder methods, that remain unfinished and are documented as such rather than glossed over.</w:t>
       </w:r>
     </w:p>
     <w:p>

</xml_diff>